<commit_message>
Deck 3.0: cinematic power slides + speaker-flow rework
- 3 new full-bleed 16:9 art pieces composed with text negative space
  (gemini-3-pro-image): wide title hero, empty-gym solitude, demo handoff
- New statement slides at the flow pivots: full-bleed title, "Nobody is
  watching." after the problem, "Enough slides." as the demo handoff —
  scripted as spoken beats with pauses
- 14-slide deck; scripts/runbook renumbered and rebuilt (PDF + docx)

Co-Authored-By: Claude Fable 5 <noreply@anthropic.com>
</commit_message>
<xml_diff>
--- a/presentation/RepMint-Script-4-Speakers.docx
+++ b/presentation/RepMint-Script-4-Speakers.docx
@@ -54,7 +54,7 @@
           <w:color w:val="161A18"/>
           <w:sz w:val="21"/>
         </w:rPr>
-        <w:t>Total: 9:45 + buffer. Deck: `RepMint-MVP-Deck.pptx` (12 slides). Demo: repmint.vercel.app</w:t>
+        <w:t>Total: 9:45 + buffer. Deck: `RepMint-MVP-Deck.pptx` (14 slides). Demo: repmint.vercel.app</w:t>
       </w:r>
     </w:p>
     <w:p>
@@ -102,7 +102,7 @@
           <w:color w:val="161A18"/>
           <w:sz w:val="29"/>
         </w:rPr>
-        <w:t>SPEAKER 1 — The Problem (0:00 – 2:00) · Slides 1–3</w:t>
+        <w:t>SPEAKER 1 — The Problem (0:00 – 2:00) · Slides 1–4</w:t>
       </w:r>
     </w:p>
     <w:p>
@@ -272,7 +272,7 @@
           <w:color w:val="161A18"/>
           <w:sz w:val="21"/>
         </w:rPr>
-        <w:t>[Slide 3 — NABC]</w:t>
+        <w:t>[Slide 4 — NABC]</w:t>
       </w:r>
       <w:r>
         <w:rPr>
@@ -350,6 +350,61 @@
           <w:color w:val="161A18"/>
           <w:sz w:val="21"/>
         </w:rPr>
+        <w:t>[Slide 3 — "Nobody is watching."]</w:t>
+      </w:r>
+      <w:r>
+        <w:rPr>
+          <w:rFonts w:ascii="Helvetica Neue" w:hAnsi="Helvetica Neue"/>
+          <w:color w:val="161A18"/>
+          <w:sz w:val="21"/>
+        </w:rPr>
+        <w:t xml:space="preserve"> </w:t>
+      </w:r>
+      <w:r>
+        <w:rPr>
+          <w:rFonts w:ascii="Helvetica Neue" w:hAnsi="Helvetica Neue"/>
+          <w:i/>
+          <w:color w:val="5E6A64"/>
+          <w:sz w:val="21"/>
+        </w:rPr>
+        <w:t>(10s beat)</w:t>
+      </w:r>
+    </w:p>
+    <w:p>
+      <w:pPr>
+        <w:spacing w:after="140" w:line="300" w:lineRule="auto"/>
+        <w:ind w:left="340"/>
+        <w:shd w:val="clear" w:fill="EFF7E0"/>
+      </w:pPr>
+      <w:r>
+        <w:rPr>
+          <w:rFonts w:ascii="Helvetica Neue" w:hAnsi="Helvetica Neue"/>
+          <w:i/>
+          <w:color w:val="5E6A64"/>
+          <w:sz w:val="21"/>
+        </w:rPr>
+        <w:t>(Say the line. Let it sit for two full seconds — the empty gym does the work. Then click.)</w:t>
+      </w:r>
+      <w:r>
+        <w:rPr>
+          <w:rFonts w:ascii="Helvetica Neue" w:hAnsi="Helvetica Neue"/>
+          <w:color w:val="161A18"/>
+          <w:sz w:val="21"/>
+        </w:rPr>
+        <w:t xml:space="preserve"> Nobody is watching. And form is the first thing that breaks.</w:t>
+      </w:r>
+    </w:p>
+    <w:p>
+      <w:pPr>
+        <w:spacing w:after="120" w:line="288" w:lineRule="auto"/>
+      </w:pPr>
+      <w:r>
+        <w:rPr>
+          <w:rFonts w:ascii="Helvetica Neue" w:hAnsi="Helvetica Neue"/>
+          <w:b/>
+          <w:color w:val="161A18"/>
+          <w:sz w:val="21"/>
+        </w:rPr>
         <w:t>HANDOFF →</w:t>
       </w:r>
       <w:r>
@@ -374,7 +429,7 @@
           <w:color w:val="161A18"/>
           <w:sz w:val="29"/>
         </w:rPr>
-        <w:t>SPEAKER 2 — The People &amp; The Product (2:00 – 3:45) · Slides 4–6</w:t>
+        <w:t>SPEAKER 2 — The People &amp; The Product (2:00 – 3:45) · Slides 5–7</w:t>
       </w:r>
     </w:p>
     <w:p>
@@ -388,7 +443,7 @@
           <w:color w:val="161A18"/>
           <w:sz w:val="21"/>
         </w:rPr>
-        <w:t>[Slide 4 — Personas]</w:t>
+        <w:t>[Slide 5 — Personas]</w:t>
       </w:r>
       <w:r>
         <w:rPr>
@@ -449,7 +504,7 @@
           <w:color w:val="161A18"/>
           <w:sz w:val="21"/>
         </w:rPr>
-        <w:t>[Slide 5 — Jump Start]</w:t>
+        <w:t>[Slide 6 — Jump Start]</w:t>
       </w:r>
       <w:r>
         <w:rPr>
@@ -495,7 +550,7 @@
           <w:color w:val="161A18"/>
           <w:sz w:val="21"/>
         </w:rPr>
-        <w:t>[Slide 6 — Solution]</w:t>
+        <w:t>[Slide 7 — Solution]</w:t>
       </w:r>
       <w:r>
         <w:rPr>
@@ -649,7 +704,20 @@
           <w:color w:val="161A18"/>
           <w:sz w:val="21"/>
         </w:rPr>
-        <w:t xml:space="preserve"> "Enough slides. [Speaker 3] — show them."</w:t>
+        <w:t xml:space="preserve"> Click to slide 8 ("Enough slides.") AS you say: "Enough</w:t>
+      </w:r>
+    </w:p>
+    <w:p>
+      <w:pPr>
+        <w:spacing w:after="120" w:line="288" w:lineRule="auto"/>
+      </w:pPr>
+      <w:r>
+        <w:rPr>
+          <w:rFonts w:ascii="Helvetica Neue" w:hAnsi="Helvetica Neue"/>
+          <w:color w:val="161A18"/>
+          <w:sz w:val="21"/>
+        </w:rPr>
+        <w:t>slides. [Speaker 3] — show them." Speaker 3 walks to the demo machine over it.</w:t>
       </w:r>
     </w:p>
     <w:p>
@@ -665,7 +733,7 @@
           <w:color w:val="161A18"/>
           <w:sz w:val="29"/>
         </w:rPr>
-        <w:t>SPEAKER 3 — Live Demo (3:45 – 7:15) · Slide 7 stays up, then the app</w:t>
+        <w:t>SPEAKER 3 — Live Demo (3:45 – 7:15) · Slide 9 stays up, then the app</w:t>
       </w:r>
     </w:p>
     <w:p>
@@ -678,7 +746,7 @@
           <w:color w:val="161A18"/>
           <w:sz w:val="21"/>
         </w:rPr>
-        <w:t>*(Slide 7 shows the run-of-show + QR while you switch to the browser.</w:t>
+        <w:t>*(Slide 8 is your entrance music; click to slide 9 — run-of-show + QR while you switch to the browser.</w:t>
       </w:r>
     </w:p>
     <w:p>
@@ -1134,7 +1202,7 @@
           <w:color w:val="161A18"/>
           <w:sz w:val="29"/>
         </w:rPr>
-        <w:t>SPEAKER 4 — Business, Architecture, Close (7:15 – 9:45) · Slides 8–12</w:t>
+        <w:t>SPEAKER 4 — Business, Architecture, Close (7:15 – 9:45) · Slides 10–14</w:t>
       </w:r>
     </w:p>
     <w:p>
@@ -1148,7 +1216,7 @@
           <w:color w:val="161A18"/>
           <w:sz w:val="21"/>
         </w:rPr>
-        <w:t>[Slide 8 — Business value]</w:t>
+        <w:t>[Slide 10 — Business value]</w:t>
       </w:r>
       <w:r>
         <w:rPr>
@@ -1211,7 +1279,7 @@
           <w:color w:val="161A18"/>
           <w:sz w:val="21"/>
         </w:rPr>
-        <w:t>[Slide 9 — Architecture]</w:t>
+        <w:t>[Slide 11 — Architecture]</w:t>
       </w:r>
       <w:r>
         <w:rPr>
@@ -1257,7 +1325,7 @@
           <w:color w:val="161A18"/>
           <w:sz w:val="21"/>
         </w:rPr>
-        <w:t>[Slide 10 — Reliability]</w:t>
+        <w:t>[Slide 12 — Reliability]</w:t>
       </w:r>
       <w:r>
         <w:rPr>
@@ -1320,7 +1388,7 @@
           <w:color w:val="161A18"/>
           <w:sz w:val="21"/>
         </w:rPr>
-        <w:t>[Slide 11 — Future &amp; conclusions]</w:t>
+        <w:t>[Slide 13 — Future &amp; conclusions]</w:t>
       </w:r>
       <w:r>
         <w:rPr>
@@ -1366,7 +1434,7 @@
           <w:color w:val="161A18"/>
           <w:sz w:val="21"/>
         </w:rPr>
-        <w:t>[Slide 12 — Close]</w:t>
+        <w:t>[Slide 14 — Close]</w:t>
       </w:r>
       <w:r>
         <w:rPr>

</xml_diff>